<commit_message>
Fix TATSUKI acronym expansion: Dynamic Retrospective Delegation → Trust-Adjusted Transparent Scoring
All occurrences of the old expansion 'Dynamic Retrospective Delegation with
Candidate Trust' replaced with the correct 'Trust-Adjusted Transparent Scoring
with Unified Knowledge Integration' in EN paper (abstract, intro, conclusion),
JA paper (abstract, intro, conclusion), and PPTX (slide 1 subtitle).
Also fixed 襟→襷 typo in PPTX.

Co-Authored-By: Tatsuki Onishi <bougtoir@gmail.com>
</commit_message>
<xml_diff>
--- a/tasuki-electoral-model/output/docx/TATSUKI_Electoral_Studies_English.docx
+++ b/tasuki-electoral-model/output/docx/TATSUKI_Electoral_Studies_English.docx
@@ -69,7 +69,7 @@
     </w:p>
     <w:p>
       <w:r>
-        <w:t>Democratic elections serve as the primary mechanism through which citizens hold representatives accountable, yet the binary nature of electoral sanctions (re-election versus removal) provides only a coarse instrument for incentivizing policy fulfillment. We propose Dynamic Retrospective Delegation with Candidate Trust (TATSUKI), a novel electoral mechanism in which candidates pre-declare weighted policy pledges, third-party evaluators assess fulfillment at term end, and the resulting accountability score modulates a candidate-level trust coefficient that influences their effective electoral support in subsequent elections. Using an agent-based model compliant with the ODD protocol, we simulate multi-generational electoral dynamics under TATSUKI across a family of influence functions. We calibrate the model using empirical pledge fulfillment data from the Polimeter project (1,050 promises across three Canadian federal parliamentary terms) and cross-national data from Thomson et al. (2017). Our results show that TATSUKI (i) significantly raises mean accountability scores relative to standard elections, (ii) induces evolutionary selection pressure favoring sincere candidates over populist and deceptive strategists, (iii) exhibits robustness to adversarial exploitation strategies discovered via genetic algorithm search, and (iv) produces counterfactual trust trajectories consistent with empirical fulfillment patterns when applied retrospectively to real-world data. Sensitivity analysis reveals that concave and sigmoid influence functions offer the best trade-off between incentive strength and resistance to manipulation. We discuss implications for institutional design and the compatibility of TATSUKI with the one-person-one-vote principle through candidate-centric trust reinterpretation.</w:t>
+        <w:t>Democratic elections serve as the primary mechanism through which citizens hold representatives accountable, yet the binary nature of electoral sanctions (re-election versus removal) provides only a coarse instrument for incentivizing policy fulfillment. We propose Trust-Adjusted Transparent Scoring with Unified Knowledge Integration (TATSUKI), a novel electoral mechanism in which candidates pre-declare weighted policy pledges, third-party evaluators assess fulfillment at term end, and the resulting accountability score modulates a candidate-level trust coefficient that influences their effective electoral support in subsequent elections. Using an agent-based model compliant with the ODD protocol, we simulate multi-generational electoral dynamics under TATSUKI across a family of influence functions. We calibrate the model using empirical pledge fulfillment data from the Polimeter project (1,050 promises across three Canadian federal parliamentary terms) and cross-national data from Thomson et al. (2017). Our results show that TATSUKI (i) significantly raises mean accountability scores relative to standard elections, (ii) induces evolutionary selection pressure favoring sincere candidates over populist and deceptive strategists, (iii) exhibits robustness to adversarial exploitation strategies discovered via genetic algorithm search, and (iv) produces counterfactual trust trajectories consistent with empirical fulfillment patterns when applied retrospectively to real-world data. Sensitivity analysis reveals that concave and sigmoid influence functions offer the best trade-off between incentive strength and resistance to manipulation. We discuss implications for institutional design and the compatibility of TATSUKI with the one-person-one-vote principle through candidate-centric trust reinterpretation.</w:t>
       </w:r>
     </w:p>
     <w:p>
@@ -110,7 +110,7 @@
     </w:p>
     <w:p>
       <w:r>
-        <w:t>In this paper, we propose Dynamic Retrospective Delegation with Candidate Trust (TATSUKI), an electoral mechanism that bridges the gap between informal retrospective voting and formal institutional design. Under TATSUKI, candidates pre-declare a weighted portfolio of policy pledges at election time, an independent evaluation body assesses fulfillment at the end of the term, and the resulting accountability score is transformed via an influence function into a trust coefficient that modulates the candidate's effective electoral support in subsequent elections. Crucially, we frame this adjustment as a candidate-level trust coefficient rather than a modification of individual voter weights, thereby maintaining compatibility with the one-person-one-vote principle.</w:t>
+        <w:t>In this paper, we propose Trust-Adjusted Transparent Scoring with Unified Knowledge Integration (TATSUKI), an electoral mechanism that bridges the gap between informal retrospective voting and formal institutional design. Under TATSUKI, candidates pre-declare a weighted portfolio of policy pledges at election time, an independent evaluation body assesses fulfillment at the end of the term, and the resulting accountability score is transformed via an influence function into a trust coefficient that modulates the candidate's effective electoral support in subsequent elections. Crucially, we frame this adjustment as a candidate-level trust coefficient rather than a modification of individual voter weights, thereby maintaining compatibility with the one-person-one-vote principle.</w:t>
       </w:r>
     </w:p>
     <w:p>
@@ -1232,7 +1232,7 @@
     </w:p>
     <w:p>
       <w:r>
-        <w:t>We have introduced Dynamic Retrospective Delegation with Candidate Trust (TATSUKI), a novel electoral mechanism that institutionalizes retrospective accountability by linking candidate trust coefficients to measured policy fulfillment. Through an ODD-compliant agent-based model calibrated with empirical pledge fulfillment data from the Polimeter project and cross-national benchmarks from Thomson et al. (2017), we demonstrated that TATSUKI raises accountability levels, selects for sincere candidates, and exhibits robustness to adversarial exploitation. Counterfactual analysis using real-world data from three Canadian parliamentary terms confirms that TATSUKI produces stable, interpretable trust trajectories consistent with observed fulfillment patterns. The mechanism is parameterized by a family of influence functions, with concave and sigmoid specifications offering the best trade-off between incentive strength and manipulation resistance. By framing the trust adjustment at the candidate level rather than the voter level, TATSUKI maintains compatibility with the one-person-one-vote principle while introducing a principled mechanism for performance-based electoral influence.</w:t>
+        <w:t>We have introduced Trust-Adjusted Transparent Scoring with Unified Knowledge Integration (TATSUKI), a novel electoral mechanism that institutionalizes retrospective accountability by linking candidate trust coefficients to measured policy fulfillment. Through an ODD-compliant agent-based model calibrated with empirical pledge fulfillment data from the Polimeter project and cross-national benchmarks from Thomson et al. (2017), we demonstrated that TATSUKI raises accountability levels, selects for sincere candidates, and exhibits robustness to adversarial exploitation. Counterfactual analysis using real-world data from three Canadian parliamentary terms confirms that TATSUKI produces stable, interpretable trust trajectories consistent with observed fulfillment patterns. The mechanism is parameterized by a family of influence functions, with concave and sigmoid specifications offering the best trade-off between incentive strength and manipulation resistance. By framing the trust adjustment at the candidate level rather than the voter level, TATSUKI maintains compatibility with the one-person-one-vote principle while introducing a principled mechanism for performance-based electoral influence.</w:t>
       </w:r>
     </w:p>
     <w:p>

</xml_diff>